<commit_message>
Boutons d'export P1+P2 : registre CSV (Projet) + Excel Budget/Grille fournisseur
- Gestion de projet : bouton "Exporter (CSV)" générique sur tous les
  registres (jalons, livrables, décisions, réserves, obstacles,
  indicateurs, leçons, risques, budget), sur le modèle déjà en place
  pour Opérations et Contrats fournisseurs.
- Gestion de projet : bouton "Exporter (Excel)" dédié sur l'écran
  Budget (synthèse + détail des postes budgétaires sur deux feuilles).
- Contrats fournisseurs : bouton "Exporter (Excel)" sur la Grille
  fournisseur (référentiel fournisseurs + historique des évaluations
  sur deux feuilles), avec ajout de la librairie SheetJS.
- Correction du document d'analyse : le registre des courriers
  disposait déjà d'un export CSV (bouton existant, non détecté lors
  de la première passe) ; la recommandation correspondante est
  retirée et une section "État d'implémentation" est ajoutée.
</commit_message>
<xml_diff>
--- a/Analyse_Boutons_Extraction_D2MG_Pilotage.docx
+++ b/Analyse_Boutons_Extraction_D2MG_Pilotage.docx
@@ -478,7 +478,7 @@
         <w:rPr>
           <w:i w:val="0"/>
         </w:rPr>
-        <w:t>Deux constats : d'une part, les exports « Sauvegarde » existants sont des instantanés techniques de toute la base du module (utiles en cas de restauration), pas des documents lisibles par un tiers — ils ne répondent pas au besoin d'usage externe visé ici. D'autre part, Courriers et Gestion de projet sont en retard sur Opérations et Contrats fournisseurs, qui offrent déjà un export CSV du registre et un rapport HTML autonome en plus de l'impression.</w:t>
+        <w:t>Deux constats : d'une part, les exports « Sauvegarde » existants sont des instantanés techniques de toute la base du module (utiles en cas de restauration), pas des documents lisibles par un tiers — ils ne répondent pas au besoin d'usage externe visé ici. D'autre part, Gestion de projet est en retard sur les trois autres chambres, qui offrent déjà un export CSV de leur registre (Courriers via un bouton existant sur l'écran Registre, Opérations et Contrats fournisseurs comme détaillé plus haut).</w:t>
       </w:r>
     </w:p>
     <w:p>
@@ -690,7 +690,7 @@
               <w:rPr>
                 <w:sz w:val="19"/>
               </w:rPr>
-              <w:t>Excel (CSV)</w:t>
+              <w:t>Déjà en place (CSV)</w:t>
             </w:r>
           </w:p>
         </w:tc>
@@ -704,7 +704,7 @@
               <w:rPr>
                 <w:sz w:val="19"/>
               </w:rPr>
-              <w:t>Priorité n°1 : la DFC et les directions demandent régulièrement l'état du courrier sur une période — aujourd'hui il faut le retaper à la main.</w:t>
+              <w:t>Correctif : un bouton « Exporter en CSV » existe déjà sur cet écran (droit cou.exporter) — vérifié après relecture du code. Aucun ajout nécessaire ici.</w:t>
             </w:r>
           </w:p>
         </w:tc>
@@ -2059,6 +2059,325 @@
         <w:t>Aucun de ces chantiers ne modifie les données ou les droits d'usage existants : ce sont des ajouts de boutons de lecture seule, sans risque pour le registre en cours d'exploitation.</w:t>
       </w:r>
     </w:p>
+    <w:p>
+      <w:pPr>
+        <w:keepNext/>
+        <w:spacing w:before="360" w:after="120"/>
+        <w:pBdr>
+          <w:bottom w:val="single" w:sz="6" w:color="2C4A63"/>
+        </w:pBdr>
+      </w:pPr>
+      <w:r>
+        <w:rPr>
+          <w:b/>
+          <w:color w:val="1B2F3F"/>
+          <w:sz w:val="30"/>
+        </w:rPr>
+        <w:t>5. État d'implémentation (mise à jour du 01/09/2026)</w:t>
+      </w:r>
+    </w:p>
+    <w:p>
+      <w:pPr>
+        <w:spacing w:after="160"/>
+      </w:pPr>
+      <w:r>
+        <w:rPr>
+          <w:i w:val="0"/>
+        </w:rPr>
+        <w:t>À la relecture du code lors de la mise en œuvre, le registre des courriers disposait déjà d'un export CSV (bouton existant, non détecté lors de la première passe d'analyse) : la ligne correspondante ci-dessus a été corrigée en conséquence.</w:t>
+      </w:r>
+    </w:p>
+    <w:tbl>
+      <w:tblPr>
+        <w:tblStyle w:val="TableGrid"/>
+        <w:tblW w:type="auto" w:w="0"/>
+        <w:jc w:val="center"/>
+        <w:tblLook w:firstColumn="1" w:firstRow="1" w:lastColumn="0" w:lastRow="0" w:noHBand="0" w:noVBand="1" w:val="04A0"/>
+      </w:tblPr>
+      <w:tblGrid>
+        <w:gridCol w:w="3324"/>
+        <w:gridCol w:w="3324"/>
+        <w:gridCol w:w="3324"/>
+      </w:tblGrid>
+      <w:tr>
+        <w:tc>
+          <w:tcPr>
+            <w:tcW w:type="dxa" w:w="3402"/>
+            <w:shd w:val="clear" w:color="auto" w:fill="1B2F3F"/>
+          </w:tcPr>
+          <w:p>
+            <w:r/>
+            <w:r>
+              <w:rPr>
+                <w:b/>
+                <w:color w:val="FFFFFF"/>
+                <w:sz w:val="19"/>
+              </w:rPr>
+              <w:t>Action</w:t>
+            </w:r>
+          </w:p>
+        </w:tc>
+        <w:tc>
+          <w:tcPr>
+            <w:tcW w:type="dxa" w:w="1984"/>
+            <w:shd w:val="clear" w:color="auto" w:fill="1B2F3F"/>
+          </w:tcPr>
+          <w:p>
+            <w:r/>
+            <w:r>
+              <w:rPr>
+                <w:b/>
+                <w:color w:val="FFFFFF"/>
+                <w:sz w:val="19"/>
+              </w:rPr>
+              <w:t>Chambre</w:t>
+            </w:r>
+          </w:p>
+        </w:tc>
+        <w:tc>
+          <w:tcPr>
+            <w:tcW w:type="dxa" w:w="3685"/>
+            <w:shd w:val="clear" w:color="auto" w:fill="1B2F3F"/>
+          </w:tcPr>
+          <w:p>
+            <w:r/>
+            <w:r>
+              <w:rPr>
+                <w:b/>
+                <w:color w:val="FFFFFF"/>
+                <w:sz w:val="19"/>
+              </w:rPr>
+              <w:t>État</w:t>
+            </w:r>
+          </w:p>
+        </w:tc>
+      </w:tr>
+      <w:tr>
+        <w:tc>
+          <w:tcPr>
+            <w:tcW w:type="dxa" w:w="3402"/>
+          </w:tcPr>
+          <w:p>
+            <w:r/>
+            <w:r>
+              <w:rPr>
+                <w:sz w:val="19"/>
+              </w:rPr>
+              <w:t>Export CSV du registre</w:t>
+            </w:r>
+          </w:p>
+        </w:tc>
+        <w:tc>
+          <w:tcPr>
+            <w:tcW w:type="dxa" w:w="1984"/>
+          </w:tcPr>
+          <w:p>
+            <w:r/>
+            <w:r>
+              <w:rPr>
+                <w:sz w:val="19"/>
+              </w:rPr>
+              <w:t>Gestion des courriers</w:t>
+            </w:r>
+          </w:p>
+        </w:tc>
+        <w:tc>
+          <w:tcPr>
+            <w:tcW w:type="dxa" w:w="3685"/>
+          </w:tcPr>
+          <w:p>
+            <w:r/>
+            <w:r>
+              <w:rPr>
+                <w:sz w:val="19"/>
+              </w:rPr>
+              <w:t>Déjà en place — aucune action.</w:t>
+            </w:r>
+          </w:p>
+        </w:tc>
+      </w:tr>
+      <w:tr>
+        <w:tc>
+          <w:tcPr>
+            <w:tcW w:type="dxa" w:w="3402"/>
+          </w:tcPr>
+          <w:p>
+            <w:r/>
+            <w:r>
+              <w:rPr>
+                <w:sz w:val="19"/>
+              </w:rPr>
+              <w:t>Export CSV du registre (jalons, livrables, décisions, réserves, obstacles, indicateurs, leçons, risques, budget)</w:t>
+            </w:r>
+          </w:p>
+        </w:tc>
+        <w:tc>
+          <w:tcPr>
+            <w:tcW w:type="dxa" w:w="1984"/>
+          </w:tcPr>
+          <w:p>
+            <w:r/>
+            <w:r>
+              <w:rPr>
+                <w:sz w:val="19"/>
+              </w:rPr>
+              <w:t>Gestion de projet</w:t>
+            </w:r>
+          </w:p>
+        </w:tc>
+        <w:tc>
+          <w:tcPr>
+            <w:tcW w:type="dxa" w:w="3685"/>
+          </w:tcPr>
+          <w:p>
+            <w:r/>
+            <w:r>
+              <w:rPr>
+                <w:sz w:val="19"/>
+              </w:rPr>
+              <w:t>Fait — bouton « Exporter (CSV) » ajouté sur l'écran Registre, générique à toutes ses rubriques.</w:t>
+            </w:r>
+          </w:p>
+        </w:tc>
+      </w:tr>
+      <w:tr>
+        <w:tc>
+          <w:tcPr>
+            <w:tcW w:type="dxa" w:w="3402"/>
+          </w:tcPr>
+          <w:p>
+            <w:r/>
+            <w:r>
+              <w:rPr>
+                <w:sz w:val="19"/>
+              </w:rPr>
+              <w:t>Export Excel (XLSX) du Budget</w:t>
+            </w:r>
+          </w:p>
+        </w:tc>
+        <w:tc>
+          <w:tcPr>
+            <w:tcW w:type="dxa" w:w="1984"/>
+          </w:tcPr>
+          <w:p>
+            <w:r/>
+            <w:r>
+              <w:rPr>
+                <w:sz w:val="19"/>
+              </w:rPr>
+              <w:t>Gestion de projet</w:t>
+            </w:r>
+          </w:p>
+        </w:tc>
+        <w:tc>
+          <w:tcPr>
+            <w:tcW w:type="dxa" w:w="3685"/>
+          </w:tcPr>
+          <w:p>
+            <w:r/>
+            <w:r>
+              <w:rPr>
+                <w:sz w:val="19"/>
+              </w:rPr>
+              <w:t>Fait — bouton dédié « Exporter (Excel) », synthèse + détail des postes budgétaires sur deux feuilles.</w:t>
+            </w:r>
+          </w:p>
+        </w:tc>
+      </w:tr>
+      <w:tr>
+        <w:tc>
+          <w:tcPr>
+            <w:tcW w:type="dxa" w:w="3402"/>
+          </w:tcPr>
+          <w:p>
+            <w:r/>
+            <w:r>
+              <w:rPr>
+                <w:sz w:val="19"/>
+              </w:rPr>
+              <w:t>Export Excel (XLSX) de la Grille fournisseur</w:t>
+            </w:r>
+          </w:p>
+        </w:tc>
+        <w:tc>
+          <w:tcPr>
+            <w:tcW w:type="dxa" w:w="1984"/>
+          </w:tcPr>
+          <w:p>
+            <w:r/>
+            <w:r>
+              <w:rPr>
+                <w:sz w:val="19"/>
+              </w:rPr>
+              <w:t>Gestion des contrats fournisseurs</w:t>
+            </w:r>
+          </w:p>
+        </w:tc>
+        <w:tc>
+          <w:tcPr>
+            <w:tcW w:type="dxa" w:w="3685"/>
+          </w:tcPr>
+          <w:p>
+            <w:r/>
+            <w:r>
+              <w:rPr>
+                <w:sz w:val="19"/>
+              </w:rPr>
+              <w:t>Fait — bouton « Exporter (Excel) », référentiel fournisseurs + historique des évaluations sur deux feuilles.</w:t>
+            </w:r>
+          </w:p>
+        </w:tc>
+      </w:tr>
+      <w:tr>
+        <w:tc>
+          <w:tcPr>
+            <w:tcW w:type="dxa" w:w="3402"/>
+          </w:tcPr>
+          <w:p>
+            <w:r/>
+            <w:r>
+              <w:rPr>
+                <w:sz w:val="19"/>
+              </w:rPr>
+              <w:t>PDF institutionnel pour les 4 rapports périodiques</w:t>
+            </w:r>
+          </w:p>
+        </w:tc>
+        <w:tc>
+          <w:tcPr>
+            <w:tcW w:type="dxa" w:w="1984"/>
+          </w:tcPr>
+          <w:p>
+            <w:r/>
+            <w:r>
+              <w:rPr>
+                <w:sz w:val="19"/>
+              </w:rPr>
+              <w:t>Les quatre chambres</w:t>
+            </w:r>
+          </w:p>
+        </w:tc>
+        <w:tc>
+          <w:tcPr>
+            <w:tcW w:type="dxa" w:w="3685"/>
+          </w:tcPr>
+          <w:p>
+            <w:r/>
+            <w:r>
+              <w:rPr>
+                <w:sz w:val="19"/>
+              </w:rPr>
+              <w:t>Non commencé — chantier de priorité 3, à cadrer séparément si retenu.</w:t>
+            </w:r>
+          </w:p>
+        </w:tc>
+      </w:tr>
+    </w:tbl>
+    <w:p>
+      <w:pPr>
+        <w:spacing w:after="80"/>
+      </w:pPr>
+    </w:p>
     <w:sectPr>
       <w:pgSz w:w="12240" w:h="15840"/>
       <w:pgMar w:top="1134" w:right="1134" w:bottom="1020" w:left="1134" w:header="720" w:footer="720" w:gutter="0"/>

</xml_diff>